<commit_message>
Kim11-3-2-Nanoteknolojik-Urunler: gorsel alanlarina Shutter onizlemeleri yerlestirildi (2.3 bicimi)
</commit_message>
<xml_diff>
--- a/Kim11-3-2-Nanoteknolojik-Urunler.docx
+++ b/Kim11-3-2-Nanoteknolojik-Urunler.docx
@@ -77,77 +77,60 @@
           <w:tcPr>
             <w:tcW w:w="4500" w:type="dxa"/>
           </w:tcPr>
-          <w:tbl>
-            <w:tblPr>
-              <w:tblW w:w="4300" w:type="dxa"/>
+          <w:p>
+            <w:pPr>
               <w:jc w:val="center"/>
-              <w:tblBorders>
-                <w:top w:val="single" w:sz="8" w:space="0" w:color="7F7F7F"/>
-                <w:left w:val="single" w:sz="8" w:space="0" w:color="7F7F7F"/>
-                <w:bottom w:val="single" w:sz="8" w:space="0" w:color="7F7F7F"/>
-                <w:right w:val="single" w:sz="8" w:space="0" w:color="7F7F7F"/>
-              </w:tblBorders>
-            </w:tblPr>
-            <w:tblGrid>
-              <w:gridCol w:w="4300"/>
-            </w:tblGrid>
-            <w:tr>
-              <w:tc>
-                <w:tcPr>
-                  <w:tcW w:w="4300" w:type="dxa"/>
-                  <w:shd w:val="clear" w:color="auto" w:fill="EDEDED"/>
-                </w:tcPr>
-                <w:p>
-                  <w:pPr>
-                    <w:jc w:val="both"/>
-                    <w:rPr>
-                      <w:rFonts w:ascii="Times New Roman" w:hAnsi="Times New Roman" w:cs="Times New Roman"/>
-                      <w:lang w:val="tr-TR"/>
-                    </w:rPr>
-                  </w:pPr>
-                  <w:r>
-                    <w:rPr>
-                      <w:rFonts w:ascii="Times New Roman" w:hAnsi="Times New Roman" w:cs="Times New Roman"/>
-                      <w:lang w:val="tr-TR"/>
-                    </w:rPr>
-                    <w:t xml:space="preserve">GÖRSEL ALANI (Shutterstock)</w:t>
-                  </w:r>
-                </w:p>
-                <w:p>
-                  <w:pPr>
-                    <w:jc w:val="both"/>
-                    <w:rPr>
-                      <w:rFonts w:ascii="Times New Roman" w:hAnsi="Times New Roman" w:cs="Times New Roman"/>
-                      <w:lang w:val="tr-TR"/>
-                    </w:rPr>
-                  </w:pPr>
-                  <w:r>
-                    <w:rPr>
-                      <w:rFonts w:ascii="Times New Roman" w:hAnsi="Times New Roman" w:cs="Times New Roman"/>
-                      <w:lang w:val="tr-TR"/>
-                    </w:rPr>
-                    <w:t xml:space="preserve">Tarif: Plajda ele sıkılmış beyaz güneş kremi; marka görünmeyen tüp.</w:t>
-                  </w:r>
-                </w:p>
-                <w:p>
-                  <w:pPr>
-                    <w:jc w:val="both"/>
-                    <w:rPr>
-                      <w:rFonts w:ascii="Times New Roman" w:hAnsi="Times New Roman" w:cs="Times New Roman"/>
-                      <w:lang w:val="tr-TR"/>
-                    </w:rPr>
-                  </w:pPr>
-                  <w:r>
-                    <w:rPr>
-                      <w:rFonts w:ascii="Times New Roman" w:hAnsi="Times New Roman" w:cs="Times New Roman"/>
-                      <w:lang w:val="tr-TR"/>
-                    </w:rPr>
-                    <w:t xml:space="preserve">Shutter ID: 2590579899 (fotoğraf) — Woman applying sunscreen on arm at beach</w:t>
-                  </w:r>
-                </w:p>
-              </w:tc>
-            </w:tr>
-          </w:tbl>
+            </w:pPr>
+            <w:r>
+              <w:drawing>
+                <wp:inline xmlns:a="http://schemas.openxmlformats.org/drawingml/2006/main" xmlns:pic="http://schemas.openxmlformats.org/drawingml/2006/picture">
+                  <wp:extent cx="2664000" cy="1953600"/>
+                  <wp:docPr id="900008" name="Picture 900008"/>
+                  <wp:cNvGraphicFramePr>
+                    <a:graphicFrameLocks noChangeAspect="1"/>
+                  </wp:cNvGraphicFramePr>
+                  <a:graphic>
+                    <a:graphicData uri="http://schemas.openxmlformats.org/drawingml/2006/picture">
+                      <pic:pic>
+                        <pic:nvPicPr>
+                          <pic:cNvPr id="0" name="2590579899_d.jpg"/>
+                          <pic:cNvPicPr/>
+                        </pic:nvPicPr>
+                        <pic:blipFill>
+                          <a:blip r:embed="rId11"/>
+                          <a:stretch>
+                            <a:fillRect/>
+                          </a:stretch>
+                        </pic:blipFill>
+                        <pic:spPr>
+                          <a:xfrm>
+                            <a:off x="0" y="0"/>
+                            <a:ext cx="2664000" cy="1953600"/>
+                          </a:xfrm>
+                          <a:prstGeom prst="rect"/>
+                        </pic:spPr>
+                      </pic:pic>
+                    </a:graphicData>
+                  </a:graphic>
+                </wp:inline>
+              </w:drawing>
+            </w:r>
+          </w:p>
+          <w:p>
+            <w:pPr>
+              <w:jc w:val="center"/>
+            </w:pPr>
+            <w:r>
+              <w:rPr>
+                <w:rFonts w:ascii="Times New Roman" w:hAnsi="Times New Roman" w:cs="Times New Roman"/>
+                <w:b/>
+                <w:bCs/>
+                <w:highlight w:val="yellow"/>
+                <w:lang w:val="tr-TR"/>
+              </w:rPr>
+              <w:t xml:space="preserve">Shutter id: 2590579899</w:t>
+            </w:r>
+          </w:p>
           <w:p>
             <w:pPr>
               <w:jc w:val="center"/>
@@ -178,77 +161,60 @@
           <w:tcPr>
             <w:tcW w:w="4500" w:type="dxa"/>
           </w:tcPr>
-          <w:tbl>
-            <w:tblPr>
-              <w:tblW w:w="4300" w:type="dxa"/>
+          <w:p>
+            <w:pPr>
               <w:jc w:val="center"/>
-              <w:tblBorders>
-                <w:top w:val="single" w:sz="8" w:space="0" w:color="7F7F7F"/>
-                <w:left w:val="single" w:sz="8" w:space="0" w:color="7F7F7F"/>
-                <w:bottom w:val="single" w:sz="8" w:space="0" w:color="7F7F7F"/>
-                <w:right w:val="single" w:sz="8" w:space="0" w:color="7F7F7F"/>
-              </w:tblBorders>
-            </w:tblPr>
-            <w:tblGrid>
-              <w:gridCol w:w="4300"/>
-            </w:tblGrid>
-            <w:tr>
-              <w:tc>
-                <w:tcPr>
-                  <w:tcW w:w="4300" w:type="dxa"/>
-                  <w:shd w:val="clear" w:color="auto" w:fill="EDEDED"/>
-                </w:tcPr>
-                <w:p>
-                  <w:pPr>
-                    <w:jc w:val="both"/>
-                    <w:rPr>
-                      <w:rFonts w:ascii="Times New Roman" w:hAnsi="Times New Roman" w:cs="Times New Roman"/>
-                      <w:lang w:val="tr-TR"/>
-                    </w:rPr>
-                  </w:pPr>
-                  <w:r>
-                    <w:rPr>
-                      <w:rFonts w:ascii="Times New Roman" w:hAnsi="Times New Roman" w:cs="Times New Roman"/>
-                      <w:lang w:val="tr-TR"/>
-                    </w:rPr>
-                    <w:t xml:space="preserve">GÖRSEL ALANI (Shutterstock)</w:t>
-                  </w:r>
-                </w:p>
-                <w:p>
-                  <w:pPr>
-                    <w:jc w:val="both"/>
-                    <w:rPr>
-                      <w:rFonts w:ascii="Times New Roman" w:hAnsi="Times New Roman" w:cs="Times New Roman"/>
-                      <w:lang w:val="tr-TR"/>
-                    </w:rPr>
-                  </w:pPr>
-                  <w:r>
-                    <w:rPr>
-                      <w:rFonts w:ascii="Times New Roman" w:hAnsi="Times New Roman" w:cs="Times New Roman"/>
-                      <w:lang w:val="tr-TR"/>
-                    </w:rPr>
-                    <w:t xml:space="preserve">Tarif: Metre, milimetre, mikrometre ve nanometre ölçeklerini (insan, karınca, saç teli, hücre, virüs, DNA, atom) karşılaştıran ölçek infografiği (vektörel, Türkçeleştirilecek).</w:t>
-                  </w:r>
-                </w:p>
-                <w:p>
-                  <w:pPr>
-                    <w:jc w:val="both"/>
-                    <w:rPr>
-                      <w:rFonts w:ascii="Times New Roman" w:hAnsi="Times New Roman" w:cs="Times New Roman"/>
-                      <w:lang w:val="tr-TR"/>
-                    </w:rPr>
-                  </w:pPr>
-                  <w:r>
-                    <w:rPr>
-                      <w:rFonts w:ascii="Times New Roman" w:hAnsi="Times New Roman" w:cs="Times New Roman"/>
-                      <w:lang w:val="tr-TR"/>
-                    </w:rPr>
-                    <w:t xml:space="preserve">Shutter ID: 2593335581 (vektör) — Scale comparison of things in nanometer</w:t>
-                  </w:r>
-                </w:p>
-              </w:tc>
-            </w:tr>
-          </w:tbl>
+            </w:pPr>
+            <w:r>
+              <w:drawing>
+                <wp:inline xmlns:a="http://schemas.openxmlformats.org/drawingml/2006/main" xmlns:pic="http://schemas.openxmlformats.org/drawingml/2006/picture">
+                  <wp:extent cx="1273387" cy="1979999"/>
+                  <wp:docPr id="900009" name="Picture 900009"/>
+                  <wp:cNvGraphicFramePr>
+                    <a:graphicFrameLocks noChangeAspect="1"/>
+                  </wp:cNvGraphicFramePr>
+                  <a:graphic>
+                    <a:graphicData uri="http://schemas.openxmlformats.org/drawingml/2006/picture">
+                      <pic:pic>
+                        <pic:nvPicPr>
+                          <pic:cNvPr id="0" name="2593335581_d.jpg"/>
+                          <pic:cNvPicPr/>
+                        </pic:nvPicPr>
+                        <pic:blipFill>
+                          <a:blip r:embed="rId12"/>
+                          <a:stretch>
+                            <a:fillRect/>
+                          </a:stretch>
+                        </pic:blipFill>
+                        <pic:spPr>
+                          <a:xfrm>
+                            <a:off x="0" y="0"/>
+                            <a:ext cx="1273387" cy="1979999"/>
+                          </a:xfrm>
+                          <a:prstGeom prst="rect"/>
+                        </pic:spPr>
+                      </pic:pic>
+                    </a:graphicData>
+                  </a:graphic>
+                </wp:inline>
+              </w:drawing>
+            </w:r>
+          </w:p>
+          <w:p>
+            <w:pPr>
+              <w:jc w:val="center"/>
+            </w:pPr>
+            <w:r>
+              <w:rPr>
+                <w:rFonts w:ascii="Times New Roman" w:hAnsi="Times New Roman" w:cs="Times New Roman"/>
+                <w:b/>
+                <w:bCs/>
+                <w:highlight w:val="yellow"/>
+                <w:lang w:val="tr-TR"/>
+              </w:rPr>
+              <w:t xml:space="preserve">Shutter id: 2593335581</w:t>
+            </w:r>
+          </w:p>
           <w:p>
             <w:pPr>
               <w:jc w:val="center"/>

</xml_diff>

<commit_message>
3.2: Gorsel A (gunes kremi) yerine elde krem tupu fotografi; Gorsel B okunmayan stok olcek yerine Turkce nanometre olcegi cizimi (baski boyutu)
</commit_message>
<xml_diff>
--- a/Kim11-3-2-Nanoteknolojik-Urunler.docx
+++ b/Kim11-3-2-Nanoteknolojik-Urunler.docx
@@ -84,8 +84,8 @@
             <w:r>
               <w:drawing>
                 <wp:inline xmlns:a="http://schemas.openxmlformats.org/drawingml/2006/main" xmlns:pic="http://schemas.openxmlformats.org/drawingml/2006/picture">
-                  <wp:extent cx="2664000" cy="1953600"/>
-                  <wp:docPr id="900008" name="Picture 900008"/>
+                  <wp:extent cx="2628000" cy="1930704"/>
+                  <wp:docPr id="900010" name="Picture 900010"/>
                   <wp:cNvGraphicFramePr>
                     <a:graphicFrameLocks noChangeAspect="1"/>
                   </wp:cNvGraphicFramePr>
@@ -93,11 +93,11 @@
                     <a:graphicData uri="http://schemas.openxmlformats.org/drawingml/2006/picture">
                       <pic:pic>
                         <pic:nvPicPr>
-                          <pic:cNvPr id="0" name="2590579899_d.jpg"/>
+                          <pic:cNvPr id="0" name="2822984173_d.jpg"/>
                           <pic:cNvPicPr/>
                         </pic:nvPicPr>
                         <pic:blipFill>
-                          <a:blip r:embed="rId11"/>
+                          <a:blip r:embed="rId13"/>
                           <a:stretch>
                             <a:fillRect/>
                           </a:stretch>
@@ -105,7 +105,7 @@
                         <pic:spPr>
                           <a:xfrm>
                             <a:off x="0" y="0"/>
-                            <a:ext cx="2664000" cy="1953600"/>
+                            <a:ext cx="2628000" cy="1930704"/>
                           </a:xfrm>
                           <a:prstGeom prst="rect"/>
                         </pic:spPr>
@@ -128,7 +128,7 @@
                 <w:highlight w:val="yellow"/>
                 <w:lang w:val="tr-TR"/>
               </w:rPr>
-              <w:t xml:space="preserve">Shutter id: 2590579899</w:t>
+              <w:t xml:space="preserve">Shutter id: 2822984173</w:t>
             </w:r>
           </w:p>
           <w:p>
@@ -168,8 +168,8 @@
             <w:r>
               <w:drawing>
                 <wp:inline xmlns:a="http://schemas.openxmlformats.org/drawingml/2006/main" xmlns:pic="http://schemas.openxmlformats.org/drawingml/2006/picture">
-                  <wp:extent cx="1273387" cy="1979999"/>
-                  <wp:docPr id="900009" name="Picture 900009"/>
+                  <wp:extent cx="2628000" cy="2518246"/>
+                  <wp:docPr id="900011" name="Picture 900011"/>
                   <wp:cNvGraphicFramePr>
                     <a:graphicFrameLocks noChangeAspect="1"/>
                   </wp:cNvGraphicFramePr>
@@ -177,11 +177,11 @@
                     <a:graphicData uri="http://schemas.openxmlformats.org/drawingml/2006/picture">
                       <pic:pic>
                         <pic:nvPicPr>
-                          <pic:cNvPr id="0" name="2593335581_d.jpg"/>
+                          <pic:cNvPr id="0" name="k11_32_nanometre_olcegi.png"/>
                           <pic:cNvPicPr/>
                         </pic:nvPicPr>
                         <pic:blipFill>
-                          <a:blip r:embed="rId12"/>
+                          <a:blip r:embed="rId14"/>
                           <a:stretch>
                             <a:fillRect/>
                           </a:stretch>
@@ -189,7 +189,7 @@
                         <pic:spPr>
                           <a:xfrm>
                             <a:off x="0" y="0"/>
-                            <a:ext cx="1273387" cy="1979999"/>
+                            <a:ext cx="2628000" cy="2518246"/>
                           </a:xfrm>
                           <a:prstGeom prst="rect"/>
                         </pic:spPr>
@@ -198,41 +198,6 @@
                   </a:graphic>
                 </wp:inline>
               </w:drawing>
-            </w:r>
-          </w:p>
-          <w:p>
-            <w:pPr>
-              <w:jc w:val="center"/>
-            </w:pPr>
-            <w:r>
-              <w:rPr>
-                <w:rFonts w:ascii="Times New Roman" w:hAnsi="Times New Roman" w:cs="Times New Roman"/>
-                <w:b/>
-                <w:bCs/>
-                <w:highlight w:val="yellow"/>
-                <w:lang w:val="tr-TR"/>
-              </w:rPr>
-              <w:t xml:space="preserve">Shutter id: 2593335581</w:t>
-            </w:r>
-          </w:p>
-          <w:p>
-            <w:r>
-              <w:rPr>
-                <w:rFonts w:ascii="Times New Roman" w:hAnsi="Times New Roman" w:cs="Times New Roman"/>
-                <w:b/>
-                <w:highlight w:val="yellow"/>
-                <w:lang w:val="tr-TR"/>
-              </w:rPr>
-              <w:t xml:space="preserve">NOT: </w:t>
-            </w:r>
-            <w:r>
-              <w:rPr>
-                <w:rFonts w:ascii="Times New Roman" w:hAnsi="Times New Roman" w:cs="Times New Roman"/>
-                <w:b w:val="0"/>
-                <w:highlight w:val="yellow"/>
-                <w:lang w:val="tr-TR"/>
-              </w:rPr>
-              <w:t>Görseldeki İngilizce yazılar Türkçeye çevrilecek: Nanometer (nm): Nanometre (nm); Ant: Karınca; Hair: Saç teli; Red blood cell: Alyuvar; Blood Sample: Kan örneği; Bacteria: Bakteri; Flu virus: Grip virüsü; DNA: DNA; Glucose molecule: Glikoz molekülü; Water molecule: Su molekülü. Sayılarda ondalık ayırıcı virgül olmalı (0,1).</w:t>
             </w:r>
           </w:p>
           <w:p>

</xml_diff>